<commit_message>
updated styling in WG's algo designs
</commit_message>
<xml_diff>
--- a/03_Team_Work/Team5/Milestone_5_Algorithms/IC_Done/M5_WG_1.12.1-ALG_getAddress.docx
+++ b/03_Team_Work/Team5/Milestone_5_Algorithms/IC_Done/M5_WG_1.12.1-ALG_getAddress.docx
@@ -2,19 +2,6 @@
 <file path=word/document.xml><?xml version="1.0" encoding="utf-8"?>
 <w:document xmlns:wpc="http://schemas.microsoft.com/office/word/2010/wordprocessingCanvas" xmlns:cx="http://schemas.microsoft.com/office/drawing/2014/chartex" xmlns:cx1="http://schemas.microsoft.com/office/drawing/2015/9/8/chartex" xmlns:cx2="http://schemas.microsoft.com/office/drawing/2015/10/21/chartex" xmlns:cx3="http://schemas.microsoft.com/office/drawing/2016/5/9/chartex" xmlns:cx4="http://schemas.microsoft.com/office/drawing/2016/5/10/chartex" xmlns:cx5="http://schemas.microsoft.com/office/drawing/2016/5/11/chartex" xmlns:cx6="http://schemas.microsoft.com/office/drawing/2016/5/12/chartex" xmlns:cx7="http://schemas.microsoft.com/office/drawing/2016/5/13/chartex" xmlns:cx8="http://schemas.microsoft.com/office/drawing/2016/5/14/chartex" xmlns:mc="http://schemas.openxmlformats.org/markup-compatibility/2006" xmlns:aink="http://schemas.microsoft.com/office/drawing/2016/ink" xmlns:am3d="http://schemas.microsoft.com/office/drawing/2017/model3d" xmlns:o="urn:schemas-microsoft-com:office:office" xmlns:oel="http://schemas.microsoft.com/office/2019/extlst" xmlns:r="http://schemas.openxmlformats.org/officeDocument/2006/relationships" xmlns:m="http://schemas.openxmlformats.org/officeDocument/2006/math" xmlns:v="urn:schemas-microsoft-com:vml" xmlns:wp14="http://schemas.microsoft.com/office/word/2010/wordprocessingDrawing" xmlns:wp="http://schemas.openxmlformats.org/drawingml/2006/wordprocessingDrawing" xmlns:w10="urn:schemas-microsoft-com:office:word" xmlns:w="http://schemas.openxmlformats.org/wordprocessingml/2006/main" xmlns:w14="http://schemas.microsoft.com/office/word/2010/wordml" xmlns:w15="http://schemas.microsoft.com/office/word/2012/wordml" xmlns:w16cex="http://schemas.microsoft.com/office/word/2018/wordml/cex" xmlns:w16cid="http://schemas.microsoft.com/office/word/2016/wordml/cid" xmlns:w16="http://schemas.microsoft.com/office/word/2018/wordml" xmlns:w16du="http://schemas.microsoft.com/office/word/2023/wordml/word16du" xmlns:w16sdtdh="http://schemas.microsoft.com/office/word/2020/wordml/sdtdatahash" xmlns:w16sdtfl="http://schemas.microsoft.com/office/word/2024/wordml/sdtformatlock" xmlns:w16se="http://schemas.microsoft.com/office/word/2015/wordml/symex" xmlns:wpg="http://schemas.microsoft.com/office/word/2010/wordprocessingGroup" xmlns:wpi="http://schemas.microsoft.com/office/word/2010/wordprocessingInk" xmlns:wne="http://schemas.microsoft.com/office/word/2006/wordml" xmlns:wps="http://schemas.microsoft.com/office/word/2010/wordprocessingShape" mc:Ignorable="w14 w15 w16se w16cid w16 w16cex w16sdtdh w16sdtfl w16du wp14">
   <w:body>
-    <w:p>
-      <w:pPr>
-        <w:rPr>
-          <w:rFonts w:ascii="Aptos" w:hAnsi="Aptos"/>
-        </w:rPr>
-      </w:pPr>
-      <w:r>
-        <w:rPr>
-          <w:rFonts w:ascii="Aptos" w:hAnsi="Aptos"/>
-        </w:rPr>
-        <w:t>1.12.1-ALG getAddress()</w:t>
-      </w:r>
-    </w:p>
     <w:p>
       <w:pPr>
         <w:rPr>
@@ -29,18 +16,61 @@
           <w:b/>
           <w:bCs/>
         </w:rPr>
+        <w:t xml:space="preserve">1.12.1-ALG </w:t>
+      </w:r>
+      <w:proofErr w:type="gramStart"/>
+      <w:r>
+        <w:rPr>
+          <w:rFonts w:ascii="Aptos" w:hAnsi="Aptos"/>
+          <w:b/>
+          <w:bCs/>
+        </w:rPr>
+        <w:t>getAddress(</w:t>
+      </w:r>
+      <w:proofErr w:type="gramEnd"/>
+      <w:r>
+        <w:rPr>
+          <w:rFonts w:ascii="Aptos" w:hAnsi="Aptos"/>
+          <w:b/>
+          <w:bCs/>
+        </w:rPr>
+        <w:t>)</w:t>
+      </w:r>
+    </w:p>
+    <w:p>
+      <w:pPr>
+        <w:rPr>
+          <w:rFonts w:ascii="Aptos" w:hAnsi="Aptos"/>
+          <w:b/>
+          <w:bCs/>
+          <w:sz w:val="22"/>
+          <w:szCs w:val="22"/>
+        </w:rPr>
+      </w:pPr>
+      <w:r>
+        <w:rPr>
+          <w:rFonts w:ascii="Aptos" w:hAnsi="Aptos"/>
+          <w:b/>
+          <w:bCs/>
+          <w:sz w:val="22"/>
+          <w:szCs w:val="22"/>
+        </w:rPr>
         <w:t>Purpose:</w:t>
       </w:r>
     </w:p>
     <w:p>
       <w:pPr>
         <w:rPr>
-          <w:rFonts w:ascii="Aptos" w:hAnsi="Aptos"/>
+          <w:rFonts w:ascii="Times New Roman" w:hAnsi="Times New Roman" w:cs="Times New Roman"/>
+          <w:sz w:val="22"/>
+          <w:szCs w:val="22"/>
         </w:rPr>
       </w:pPr>
       <w:r>
         <w:rPr>
-          <w:rFonts w:ascii="Aptos" w:hAnsi="Aptos"/>
+          <w:rFonts w:ascii="Times New Roman" w:hAnsi="Times New Roman" w:cs="Times New Roman"/>
+          <w:sz w:val="22"/>
+          <w:szCs w:val="22"/>
         </w:rPr>
         <w:t>Retrieves the complete address entered by the user and prepares it for validation.</w:t>
       </w:r>
@@ -195,13 +225,12 @@
                               <w:tab/>
                               <w:t>GET country</w:t>
                             </w:r>
-                          </w:p>
-                          <w:p>
-                            <w:pPr>
-                              <w:rPr>
-                                <w:rFonts w:ascii="Aptos" w:hAnsi="Aptos"/>
-                              </w:rPr>
-                            </w:pPr>
+                            <w:r>
+                              <w:rPr>
+                                <w:rFonts w:ascii="Aptos" w:hAnsi="Aptos"/>
+                              </w:rPr>
+                              <w:br/>
+                            </w:r>
                           </w:p>
                           <w:p>
                             <w:pPr>
@@ -359,13 +388,12 @@
                         <w:tab/>
                         <w:t>GET country</w:t>
                       </w:r>
-                    </w:p>
-                    <w:p>
-                      <w:pPr>
-                        <w:rPr>
-                          <w:rFonts w:ascii="Aptos" w:hAnsi="Aptos"/>
-                        </w:rPr>
-                      </w:pPr>
+                      <w:r>
+                        <w:rPr>
+                          <w:rFonts w:ascii="Aptos" w:hAnsi="Aptos"/>
+                        </w:rPr>
+                        <w:br/>
+                      </w:r>
                     </w:p>
                     <w:p>
                       <w:pPr>
@@ -407,14 +435,6 @@
             </w:pict>
           </mc:Fallback>
         </mc:AlternateContent>
-      </w:r>
-      <w:r>
-        <w:rPr>
-          <w:rFonts w:ascii="Aptos" w:hAnsi="Aptos"/>
-          <w:b/>
-          <w:bCs/>
-        </w:rPr>
-        <w:t>Pseudocode</w:t>
       </w:r>
     </w:p>
     <w:p>
@@ -1037,6 +1057,7 @@
   <w:style w:type="character" w:default="1" w:styleId="DefaultParagraphFont">
     <w:name w:val="Default Paragraph Font"/>
     <w:uiPriority w:val="1"/>
+    <w:semiHidden/>
     <w:unhideWhenUsed/>
   </w:style>
   <w:style w:type="table" w:default="1" w:styleId="TableNormal">

</xml_diff>